<commit_message>
S8-06: informe final revisado con la guía humanizer (solo redacción)
Sin cambios de contenido: mismas cifras, fechas, nombres y enlaces, 18
páginas. Se quitaron contrastes "no es X", arranques escenificados, frases
sobre el propio documento y rayas usadas como conector (título, releases,
riesgos y rangos). Quedan las rayas del nombre del tablero de Trello, del
título de la norma ISO y de las celdas vacías.

Co-Authored-By: Claude Opus 5.5 <noreply@anthropic.com>
</commit_message>
<xml_diff>
--- a/docs/08-trabajos-practicos/Informe_Final_TP6_Expediente_Electronico.docx
+++ b/docs/08-trabajos-practicos/Informe_Final_TP6_Expediente_Electronico.docx
@@ -56,10 +56,10 @@
           <w:b/>
           <w:bCs/>
         </w:rPr>
-        <w:t>Informe final — TP 6 Enfoque híbrido</w:t>
+        <w:t>Informe final del TP 6 (enfoque híbrido) · Caso:</w:t>
       </w:r>
       <w:r>
-        <w:t xml:space="preserve"> · Caso: implementación institucional de un sistema de expediente electrónico</w:t>
+        <w:t xml:space="preserve"> implementación institucional de un sistema de expediente electrónico</w:t>
       </w:r>
     </w:p>
     <w:p>
@@ -309,7 +309,7 @@
         <w:spacing w:after="120" w:line="276" w:lineRule="auto"/>
       </w:pPr>
       <w:r>
-        <w:t>Este informe junta todo el trabajo práctico 6: la gestión híbrida de la implementación de un sistema de expediente electrónico en una institución pública ficticia. No es un documento aparte de lo que hicimos: cada decisión que se describe acá tiene su artefacto en el repositorio, su tarjeta en Trello o una ejecución de la CI que la respalda.</w:t>
+        <w:t>Este informe reúne el trabajo práctico 6: la gestión híbrida de la implementación de un sistema de expediente electrónico en una institución pública ficticia. Cada decisión que se describe acá tiene su artefacto en el repositorio, su tarjeta en Trello o una ejecución de la CI que la respalda.</w:t>
       </w:r>
     </w:p>
     <w:p>
@@ -753,7 +753,7 @@
         <w:spacing w:after="120" w:line="276" w:lineRule="auto"/>
       </w:pPr>
       <w:r>
-        <w:t>Los pendientes se informan como pendientes. En ninguna parte del informe completamos una métrica o una prueba con valores que no medimos.</w:t>
+        <w:t>Las métricas y pruebas que todavía no se midieron figuran como pendientes, sin valores estimados.</w:t>
       </w:r>
     </w:p>
     <w:p>
@@ -776,7 +776,16 @@
         <w:spacing w:after="120" w:line="276" w:lineRule="auto"/>
       </w:pPr>
       <w:r>
-        <w:t xml:space="preserve">El caso tiene dos caras. Por un lado hay fecha oficial, presupuesto, normativa, controles de seguridad, hitos de infraestructura y aprobaciones institucionales: cosas que se tienen que planificar y aprobar formalmente. Por otro lado los flujos documentales, las integraciones y la experiencia de usuario no se conocen del todo al principio y se van descubriendo con pilotos y sprints. Por eso elegimos un </w:t>
+        <w:t>La fecha oficial, el presupuesto, la normativa, los controles de seguridad, los hitos de infraestructura y las aprobaciones institucionales se tienen que planificar y aprobar formalmente.</w:t>
+      </w:r>
+      <w:r>
+        <w:t xml:space="preserve"> </w:t>
+      </w:r>
+      <w:r>
+        <w:t>En cambio, los flujos documentales</w:t>
+      </w:r>
+      <w:r>
+        <w:t xml:space="preserve">, las integraciones y la experiencia de usuario no se conocen del todo al principio y se van descubriendo con pilotos y sprints. Por eso elegimos un </w:t>
       </w:r>
       <w:r>
         <w:rPr>
@@ -801,7 +810,7 @@
           <w:sz w:val="24"/>
           <w:szCs w:val="24"/>
         </w:rPr>
-        <w:t>2.1 Matriz predictivo – adaptativo – compartido</w:t>
+        <w:t>2.1 Matriz predictivo, adaptativo y compartido</w:t>
       </w:r>
     </w:p>
     <w:tbl>
@@ -1223,7 +1232,6 @@
                 <w:sz w:val="19"/>
                 <w:szCs w:val="19"/>
               </w:rPr>
-              <w:lastRenderedPageBreak/>
               <w:t>Aprobaciones institucionales</w:t>
             </w:r>
           </w:p>
@@ -1400,6 +1408,7 @@
                 <w:sz w:val="19"/>
                 <w:szCs w:val="19"/>
               </w:rPr>
+              <w:lastRenderedPageBreak/>
               <w:t>Despliegue por dependencias</w:t>
             </w:r>
           </w:p>
@@ -2196,10 +2205,10 @@
           <w:b/>
           <w:bCs/>
         </w:rPr>
-        <w:t>Cómo se aplicó de verdad:</w:t>
+        <w:t>En la práctica, las nueve solicitudes</w:t>
       </w:r>
       <w:r>
-        <w:t xml:space="preserve"> las nueve solicitudes de cambio del proyecto (CR-00 a CR-08) siguieron este camino. Por ejemplo, CR-03 la propuso el Gerente porque el Sprint 5 tenía 29 SP contra una velocidad real de 11 a 16, y la aprobó el PO sin tocar el total de 97 SP.</w:t>
+        <w:t xml:space="preserve"> de cambio del proyecto (CR-00 a CR-08) siguieron este camino. Por ejemplo, CR-03 la propuso el Gerente porque el Sprint 5 tenía 29 SP contra una velocidad real de 11 a 16, y la aprobó el PO sin tocar el total de 97 SP.</w:t>
       </w:r>
     </w:p>
     <w:p>
@@ -2291,7 +2300,13 @@
         <w:t>1.7 Desarrollo/configuración</w:t>
       </w:r>
       <w:r>
-        <w:t>, que no se descompone en la EDT sino en el Product Backlog. Ese es justamente el punto de unión entre lo predictivo (EDT) y lo adaptativo (backlog). Quedó registrado en CR-00.</w:t>
+        <w:t xml:space="preserve">, que no se descompone en la EDT sino en el Product Backlog. </w:t>
+      </w:r>
+      <w:r>
+        <w:t>Ahí se unen lo predictivo (EDT) y lo adaptativo (backlog).</w:t>
+      </w:r>
+      <w:r>
+        <w:t xml:space="preserve"> Quedó registrado en CR-00.</w:t>
       </w:r>
     </w:p>
     <w:tbl>
@@ -3254,7 +3269,7 @@
                 <w:sz w:val="19"/>
                 <w:szCs w:val="19"/>
               </w:rPr>
-              <w:t>R1 — Base del sistema</w:t>
+              <w:t>R1: base del sistema</w:t>
             </w:r>
           </w:p>
         </w:tc>
@@ -3369,7 +3384,7 @@
                 <w:sz w:val="19"/>
                 <w:szCs w:val="19"/>
               </w:rPr>
-              <w:t>R2 — Funciones principales</w:t>
+              <w:t>R2: funciones principales</w:t>
             </w:r>
           </w:p>
         </w:tc>
@@ -3484,7 +3499,7 @@
                 <w:sz w:val="19"/>
                 <w:szCs w:val="19"/>
               </w:rPr>
-              <w:t>R3 — Flujo y control</w:t>
+              <w:t>R3: flujo y control</w:t>
             </w:r>
           </w:p>
         </w:tc>
@@ -3599,7 +3614,7 @@
                 <w:sz w:val="19"/>
                 <w:szCs w:val="19"/>
               </w:rPr>
-              <w:t>R4 — Calidad y entrega</w:t>
+              <w:t>R4: calidad y entrega</w:t>
             </w:r>
           </w:p>
         </w:tc>
@@ -3965,7 +3980,6 @@
                 <w:sz w:val="19"/>
                 <w:szCs w:val="19"/>
               </w:rPr>
-              <w:lastRenderedPageBreak/>
               <w:t>Requisito</w:t>
             </w:r>
           </w:p>
@@ -4027,6 +4041,7 @@
                 <w:sz w:val="19"/>
                 <w:szCs w:val="19"/>
               </w:rPr>
+              <w:lastRenderedPageBreak/>
               <w:t>Prueba</w:t>
             </w:r>
           </w:p>
@@ -10940,17 +10955,19 @@
         <w:spacing w:after="120" w:line="276" w:lineRule="auto"/>
       </w:pPr>
       <w:r>
-        <w:t xml:space="preserve">Cada riesgo se escribe como </w:t>
+        <w:t xml:space="preserve">Cada riesgo se escribe </w:t>
       </w:r>
       <w:r>
-        <w:rPr>
-          <w:b/>
-          <w:bCs/>
-        </w:rPr>
-        <w:t>causa – evento incierto – efecto</w:t>
+        <w:t>como causa, evento incierto y efecto,</w:t>
       </w:r>
       <w:r>
-        <w:t xml:space="preserve">, con probabilidad (P) e impacto (I) de 1 a 3. Prioridad = P × I: 9 crítica, 6 alta, 3–4 media, 1–2 baja. El registro tiene </w:t>
+        <w:t xml:space="preserve"> con probabilidad (P) e impacto (I) de 1 a 3. Prioridad = P × I: 9 crítica, 6 alta, </w:t>
+      </w:r>
+      <w:r>
+        <w:t>3 o 4 media, 1 o 2 baja</w:t>
+      </w:r>
+      <w:r>
+        <w:t xml:space="preserve">. El registro tiene </w:t>
       </w:r>
       <w:r>
         <w:rPr>
@@ -11068,7 +11085,7 @@
                 <w:sz w:val="17"/>
                 <w:szCs w:val="17"/>
               </w:rPr>
-              <w:t>Riesgo (causa – evento – efecto)</w:t>
+              <w:t>Riesgo (causa, evento y efecto)</w:t>
             </w:r>
           </w:p>
         </w:tc>
@@ -18383,7 +18400,7 @@
                 <w:sz w:val="19"/>
                 <w:szCs w:val="19"/>
               </w:rPr>
-              <w:t>R1 / R2–R3</w:t>
+              <w:t>R1 / R2 y R3</w:t>
             </w:r>
           </w:p>
         </w:tc>
@@ -20274,7 +20291,10 @@
         <w:t>Rollback:</w:t>
       </w:r>
       <w:r>
-        <w:t xml:space="preserve"> volver a la etiqueta anterior, restaurar el respaldo tomado antes del despliegue (obligatorio) y, si el problema es de una sola dependencia, deshabilitar solo esa. La restauración no es teórica: la CI la ejecuta en cada cambio (ADR-13).</w:t>
+        <w:t xml:space="preserve"> volver a la etiqueta anterior, restaurar el respaldo tomado antes del despliegue (obligatorio) y, si el problema es de una sola dependencia, deshabilitar solo esa. </w:t>
+      </w:r>
+      <w:r>
+        <w:t>La CI ejecuta la restauración en cada cambio (ADR-13).</w:t>
       </w:r>
     </w:p>
     <w:p>
@@ -21228,7 +21248,7 @@
                 <w:sz w:val="17"/>
                 <w:szCs w:val="17"/>
               </w:rPr>
-              <w:t>G1; G4–G5 esperan integración</w:t>
+              <w:t>G1; G4 y G5 esperan integración</w:t>
             </w:r>
           </w:p>
         </w:tc>
@@ -21735,7 +21755,7 @@
                 <w:sz w:val="17"/>
                 <w:szCs w:val="17"/>
               </w:rPr>
-              <w:t>2 h 28 min (S1–S2)</w:t>
+              <w:t>2 h 28 min (S1 y S2)</w:t>
             </w:r>
           </w:p>
         </w:tc>
@@ -23830,6 +23850,7 @@
                 <w:sz w:val="19"/>
                 <w:szCs w:val="19"/>
               </w:rPr>
+              <w:lastRenderedPageBreak/>
               <w:t>0 de 17 PR integrados y 25 tarjetas en revisión</w:t>
             </w:r>
           </w:p>
@@ -25158,6 +25179,7 @@
                 <w:sz w:val="19"/>
                 <w:szCs w:val="19"/>
               </w:rPr>
+              <w:lastRenderedPageBreak/>
               <w:t>5. Revisar la línea base</w:t>
             </w:r>
           </w:p>
@@ -25219,7 +25241,6 @@
                 <w:sz w:val="19"/>
                 <w:szCs w:val="19"/>
               </w:rPr>
-              <w:lastRenderedPageBreak/>
               <w:t>6. Revisar riesgos y despliegue</w:t>
             </w:r>
           </w:p>
@@ -25948,7 +25969,13 @@
         <w:t>El híbrido funcionó cuando las fronteras estaban claras.</w:t>
       </w:r>
       <w:r>
-        <w:t xml:space="preserve"> La línea base, los CR y las puertas no frenaron los sprints; al contrario, nos dieron un lugar para decidir cuando el pronóstico se puso en contra (CR-03, CR-04) sin recortar en silencio.</w:t>
+        <w:t xml:space="preserve"> La línea base, los CR y las puertas </w:t>
+      </w:r>
+      <w:r>
+        <w:t>convivieron con los sprints y nos dieron un lugar para decidir</w:t>
+      </w:r>
+      <w:r>
+        <w:t xml:space="preserve"> cuando el pronóstico se puso en contra (CR-03, CR-04) sin recortar en silencio.</w:t>
       </w:r>
     </w:p>
     <w:p>
@@ -26009,7 +26036,10 @@
         <w:t>La IA aceleró mucho el desarrollo, pero se equivocó.</w:t>
       </w:r>
       <w:r>
-        <w:t xml:space="preserve"> R15 se materializó tres veces. Lo que lo controló fue la combinación de revisión humana, CI obligatoria y bitácora (Anexo D).</w:t>
+        <w:t xml:space="preserve"> R15 se materializó tres veces. </w:t>
+      </w:r>
+      <w:r>
+        <w:t>Lo controlaron la revisión humana, la CI obligatoria y la bitácora (Anexo D).</w:t>
       </w:r>
     </w:p>
     <w:p>
@@ -28505,7 +28535,13 @@
         <w:spacing w:after="60" w:line="264" w:lineRule="auto"/>
       </w:pPr>
       <w:r>
-        <w:t>Material de clases de Ingeniería de Software III — LCIK, Unidades 2 a 9, y Guía de Trabajos Prácticos (2026).</w:t>
+        <w:t xml:space="preserve">Material de clases de </w:t>
+      </w:r>
+      <w:r>
+        <w:t>Ingeniería de Software III (LCIK), Unidades 2 a 9</w:t>
+      </w:r>
+      <w:r>
+        <w:t>, y Guía de Trabajos Prácticos (2026).</w:t>
       </w:r>
     </w:p>
     <w:p>

</xml_diff>